<commit_message>
T6W3 Writing: update Week 3 plan — explanation text genre, causal connectives, 3-4 skills scope
</commit_message>
<xml_diff>
--- a/Writing/Varjak_Paw_Writing_Sequence.docx
+++ b/Writing/Varjak_Paw_Writing_Sequence.docx
@@ -113,35 +113,7 @@
                 <w:i/>
                 <w:sz w:val="20"/>
               </w:rPr>
-              <w:t>How does a writer make a reader feel characters</w:t>
-            </w:r>
-            <w:r>
-              <w:rPr>
-                <w:i/>
-                <w:sz w:val="20"/>
-              </w:rPr>
-              <w:t>’</w:t>
-            </w:r>
-            <w:r>
-              <w:rPr>
-                <w:i/>
-                <w:sz w:val="20"/>
-              </w:rPr>
-              <w:t xml:space="preserve"> </w:t>
-            </w:r>
-            <w:r>
-              <w:rPr>
-                <w:i/>
-                <w:sz w:val="20"/>
-              </w:rPr>
-              <w:t>emotions</w:t>
-            </w:r>
-            <w:r>
-              <w:rPr>
-                <w:i/>
-                <w:sz w:val="20"/>
-              </w:rPr>
-              <w:t>?</w:t>
+              <w:t>How does a writer make a reader feel characters’ emotions?</w:t>
             </w:r>
             <w:bookmarkEnd w:id="0"/>
           </w:p>
@@ -238,7 +210,7 @@
               <w:rPr>
                 <w:sz w:val="20"/>
               </w:rPr>
-              <w:t>An extended narrative recounting Varjak's first night outside the Contessa's house, written from his perspective. A shorter follow-on guide to surviving the city based on Jalal's Seven Skills.</w:t>
+              <w:t>An extended narrative recounting Varjak's first night outside the Contessa's house, written from his perspective. A shorter follow-on explanation text explaining how three or four of Jalal's Seven Skills help a cat survive the city.</w:t>
             </w:r>
           </w:p>
         </w:tc>
@@ -407,7 +379,7 @@
               <w:rPr>
                 <w:sz w:val="20"/>
               </w:rPr>
-              <w:t>• Headings, sub-headings, precise nouns, present perfect (non-fiction)</w:t>
+              <w:t>• Headings, sub-headings, precise nouns, causal connectives and fronted adverbials for cause and effect (non-fiction)</w:t>
             </w:r>
           </w:p>
         </w:tc>
@@ -552,8 +524,6 @@
       </w:pPr>
       <w:r>
         <w:t xml:space="preserve">Varjak Paw is a powerful model for atmospheric description. Said writes a familiar city through the eyes of a cat who has never been outside, so every sight and sound becomes new and strange. Short sentences mark moments of fear; longer sentences carry the rhythm of movement and search. Children meet a protagonist whose interior life drives the writing. Varjak's thoughts and reactions show us how to build character from the inside out. The Seven Skills give a clear non-fiction structure to follow, and the contrast between the </w:t>
-      </w:r>
-      <w:r>
         <w:lastRenderedPageBreak/>
         <w:t>safe house and the dangerous city lets children practise tension and atmosphere with a strong sense of purpose.</w:t>
       </w:r>
@@ -3505,11 +3475,6 @@
                 <w:sz w:val="18"/>
               </w:rPr>
               <w:t xml:space="preserve">Together, build the success criteria for the final write. </w:t>
-            </w:r>
-            <w:r>
-              <w:rPr>
-                <w:sz w:val="18"/>
-              </w:rPr>
               <w:lastRenderedPageBreak/>
               <w:t>Children record in their books or on the working wall display.</w:t>
             </w:r>
@@ -3930,7 +3895,7 @@
         <w:rPr>
           <w:i/>
         </w:rPr>
-        <w:t>This week children write the narrative across three sessions, edit and revise, then complete the shorter survival guide. The final lesson is sharing and reflecting against the key question.</w:t>
+        <w:t>This week children complete the narrative across two sessions, edit and revise, then plan and draft a shorter explanation text based on three or four of Jalal's Seven Skills. The final lesson is sharing and reflecting against the key question.</w:t>
       </w:r>
     </w:p>
     <w:tbl>
@@ -4204,11 +4169,6 @@
                 <w:sz w:val="18"/>
               </w:rPr>
               <w:t xml:space="preserve">Last five minutes: children highlight examples of figurative </w:t>
-            </w:r>
-            <w:r>
-              <w:rPr>
-                <w:sz w:val="18"/>
-              </w:rPr>
               <w:lastRenderedPageBreak/>
               <w:t>language and varied sentence structure in their writing.</w:t>
             </w:r>
@@ -4633,7 +4593,7 @@
                 <w:b/>
                 <w:sz w:val="20"/>
               </w:rPr>
-              <w:t>To analyse non-fiction features and plan the survival guide</w:t>
+              <w:t>To analyse explanation text features and plan the piece</w:t>
             </w:r>
           </w:p>
           <w:p>
@@ -4702,7 +4662,7 @@
               <w:rPr>
                 <w:sz w:val="18"/>
               </w:rPr>
-              <w:t>Show a model page from a survival guide. Identify: heading, sub-headings, precise nouns and technical vocabulary, present perfect form, instructional voice.</w:t>
+              <w:t>Show a model explanation text. Identify: rhetorical question hook, subheadings, present tense explanatory register, causal and logical connectives (therefore, as a result, due to, since), fronted adverbials for cause and effect.</w:t>
             </w:r>
           </w:p>
           <w:p>
@@ -4725,7 +4685,7 @@
               <w:rPr>
                 <w:sz w:val="18"/>
               </w:rPr>
-              <w:t>Children plan their guide using the Seven Skills as headings. For each Skill section: a sub-heading, what the skill is, when to use it, a warning or tip.</w:t>
+              <w:t>Children choose three or four skills from the Seven to write about. For each chosen skill: a subheading, what the skill is, how it works, the outcome for the cat. Peer discussion before drafting.</w:t>
             </w:r>
           </w:p>
         </w:tc>
@@ -4804,7 +4764,7 @@
                 <w:b/>
                 <w:sz w:val="20"/>
               </w:rPr>
-              <w:t>To write the introduction and first Skills sections</w:t>
+              <w:t>To write the explanation text</w:t>
             </w:r>
           </w:p>
           <w:p>
@@ -4850,14 +4810,37 @@
               <w:rPr>
                 <w:sz w:val="18"/>
               </w:rPr>
-              <w:t xml:space="preserve">Recap precise nouns and technical vocabulary from the planning lesson. Teach present perfect form: </w:t>
+              <w:t xml:space="preserve">Recap causal and logical connectives from the analysis lesson. Practise: give children a skill name and a one-sentence explanation; they extend it using two different connectives (therefore, as a result, due to, since, which means). Share and discuss which connective carries the meaning most clearly.</w:t>
+            </w:r>
+          </w:p>
+          <w:p>
+            <w:pPr>
+              <w:spacing w:before="40" w:after="40"/>
+            </w:pPr>
+            <w:r>
+              <w:rPr>
+                <w:b/>
+                <w:sz w:val="18"/>
+              </w:rPr>
+              <w:t>Model</w:t>
+            </w:r>
+          </w:p>
+          <w:p>
+            <w:pPr>
+              <w:spacing w:before="40" w:after="40"/>
+            </w:pPr>
+            <w:r>
+              <w:rPr>
+                <w:sz w:val="18"/>
+              </w:rPr>
+              <w:t xml:space="preserve">Teacher writes the introduction live, then the opening of the first Skill section. Narrate the choices: </w:t>
             </w:r>
             <w:r>
               <w:rPr>
                 <w:i/>
                 <w:sz w:val="18"/>
               </w:rPr>
-              <w:t>Once you have mastered Slow-Time, you will have learned to slow your breathing.</w:t>
+              <w:t>I’m using a subheading, then a sentence explaining what the skill is, then I need to explain how it works and what happens as a result.</w:t>
             </w:r>
           </w:p>
           <w:p>
@@ -4869,36 +4852,6 @@
                 <w:b/>
                 <w:sz w:val="18"/>
               </w:rPr>
-              <w:t>Model</w:t>
-            </w:r>
-          </w:p>
-          <w:p>
-            <w:pPr>
-              <w:spacing w:before="40" w:after="40"/>
-            </w:pPr>
-            <w:r>
-              <w:rPr>
-                <w:sz w:val="18"/>
-              </w:rPr>
-              <w:t xml:space="preserve">Teacher writes the introduction live, then the opening of the first Skill section. Narrate the choices: </w:t>
-            </w:r>
-            <w:r>
-              <w:rPr>
-                <w:i/>
-                <w:sz w:val="18"/>
-              </w:rPr>
-              <w:t>I'm using a sub-heading here, then an explanation, then a warning.</w:t>
-            </w:r>
-          </w:p>
-          <w:p>
-            <w:pPr>
-              <w:spacing w:before="40" w:after="40"/>
-            </w:pPr>
-            <w:r>
-              <w:rPr>
-                <w:b/>
-                <w:sz w:val="18"/>
-              </w:rPr>
               <w:t>Write</w:t>
             </w:r>
           </w:p>
@@ -4910,7 +4863,7 @@
               <w:rPr>
                 <w:sz w:val="18"/>
               </w:rPr>
-              <w:t>Children write the introduction and the first three Skills sections of their guide.</w:t>
+              <w:t>Children write their complete explanation text: introduction (rhetorical question, framing sentence, purpose statement), their chosen Skill sections and conclusion. The draft should be complete by the end of the session.</w:t>
             </w:r>
           </w:p>
         </w:tc>
@@ -4932,7 +4885,7 @@
               <w:rPr>
                 <w:sz w:val="18"/>
               </w:rPr>
-              <w:t>Working wall; model guide; planning frame</w:t>
+              <w:t>Working wall; model text; planning frame; connective bank display; sentence-frame scaffold for supported writers</w:t>
             </w:r>
           </w:p>
         </w:tc>
@@ -4983,12 +4936,6 @@
                 <w:sz w:val="20"/>
               </w:rPr>
               <w:t xml:space="preserve">To complete and edit </w:t>
-            </w:r>
-            <w:r>
-              <w:rPr>
-                <w:b/>
-                <w:sz w:val="20"/>
-              </w:rPr>
               <w:lastRenderedPageBreak/>
               <w:t>the guide</w:t>
             </w:r>
@@ -5037,14 +4984,8 @@
               <w:rPr>
                 <w:sz w:val="18"/>
               </w:rPr>
-              <w:t xml:space="preserve">Children complete the remaining Skills sections. Final </w:t>
-            </w:r>
-            <w:r>
-              <w:rPr>
-                <w:sz w:val="18"/>
-              </w:rPr>
-              <w:lastRenderedPageBreak/>
-              <w:t>paragraph: a warning or words of wisdom for the new cat.</w:t>
+              <w:t xml:space="preserve">Children read their explanation text aloud quietly to themselves. </w:t>
+              <w:t>Editing checklist focus: does each Skill section explain both how and why? Have at least three different connectives been used across the piece? Is the present tense consistent? Is the register formal throughout? Children make corrections in a different colour.</w:t>
             </w:r>
           </w:p>
           <w:p>
@@ -5067,7 +5008,7 @@
               <w:rPr>
                 <w:sz w:val="18"/>
               </w:rPr>
-              <w:t>Children read their guide aloud to a partner. Check: is each Skill clearly explained? Is the instructional voice consistent? Is the present perfect used at least once?</w:t>
+              <w:t>Children read their piece aloud to a partner. Partner listens for: is each skill section clear? Does the piece explain both how and why each skill works? Final versions shared: paired reading, then two or three read aloud to the class.</w:t>
             </w:r>
           </w:p>
           <w:p>
@@ -5673,7 +5614,7 @@
         <w:spacing w:after="120"/>
       </w:pPr>
       <w:r>
-        <w:t>atmosphere, setting, sensory detail, expanded noun phrase, modifying adjective, prepositional phrase, simile, alliteration, hyperbole, power of three, fronted adverbial, subordinating conjunction, subordinate clause, direct speech, inverted commas, reporting clause, speech verb, paragraph, cohesion, pronoun, present perfect, sub-heading, instructional voice.</w:t>
+        <w:t>atmosphere, setting, sensory detail, expanded noun phrase, modifying adjective, prepositional phrase, simile, alliteration, hyperbole, power of three, fronted adverbial, subordinating conjunction, subordinate clause, direct speech, inverted commas, reporting clause, speech verb, paragraph, cohesion, pronoun, explanation text, causal connective, explanatory register, subheading.</w:t>
       </w:r>
     </w:p>
     <w:p>
@@ -5710,7 +5651,7 @@
         <w:pStyle w:val="ListBullet"/>
       </w:pPr>
       <w:r>
-        <w:t>A model survival guide page is needed for Lesson 18. This should show headings, sub-headings, precise vocabulary and present perfect form.</w:t>
+        <w:t>A model explanation text is needed for Lesson 18. This should demonstrate a rhetorical question introduction, subheadings for each skill, present tense explanatory register, and a range of causal and logical connectives. The model covers all seven skills so children can use it as a reference when selecting their own three or four.</w:t>
       </w:r>
     </w:p>
     <w:p>

</xml_diff>